<commit_message>
Cập nhật Thời khóa biểu toàn bộ giáo viên tại Hệ thống mẫu văn bản và Thời khóa biểu giáo viên từ TKB toàn trường CHECK - chuẩn.xlsx
</commit_message>
<xml_diff>
--- a/Hệ thống mẫu văn bản/Nguyên đã làm/Thời khóa biểu/Thời khóa biểu - Cô Tân.docx
+++ b/Hệ thống mẫu văn bản/Nguyên đã làm/Thời khóa biểu/Thời khóa biểu - Cô Tân.docx
@@ -240,9 +240,7 @@
                 <w:rFonts w:ascii="Times New Roman" w:hAnsi="Times New Roman"/>
                 <w:sz w:val="26"/>
               </w:rPr>
-              <w:t>Toán</w:t>
-              <w:br/>
-              <w:t>(8A1)</w:t>
+              <w:t>Toán (8A1)</w:t>
             </w:r>
           </w:p>
         </w:tc>
@@ -259,9 +257,7 @@
                 <w:rFonts w:ascii="Times New Roman" w:hAnsi="Times New Roman"/>
                 <w:sz w:val="26"/>
               </w:rPr>
-              <w:t>Toán</w:t>
-              <w:br/>
-              <w:t>(8A1)</w:t>
+              <w:t>Toán (8A1)</w:t>
             </w:r>
           </w:p>
         </w:tc>
@@ -278,9 +274,7 @@
                 <w:rFonts w:ascii="Times New Roman" w:hAnsi="Times New Roman"/>
                 <w:sz w:val="26"/>
               </w:rPr>
-              <w:t>Toán</w:t>
-              <w:br/>
-              <w:t>(8A1)</w:t>
+              <w:t>Toán (8A1)</w:t>
             </w:r>
           </w:p>
         </w:tc>
@@ -335,9 +329,7 @@
                 <w:rFonts w:ascii="Times New Roman" w:hAnsi="Times New Roman"/>
                 <w:sz w:val="26"/>
               </w:rPr>
-              <w:t>Toán</w:t>
-              <w:br/>
-              <w:t>(7A1)</w:t>
+              <w:t>Toán (7A1)</w:t>
             </w:r>
           </w:p>
         </w:tc>
@@ -360,9 +352,7 @@
                 <w:rFonts w:ascii="Times New Roman" w:hAnsi="Times New Roman"/>
                 <w:sz w:val="26"/>
               </w:rPr>
-              <w:t>Toán</w:t>
-              <w:br/>
-              <w:t>(7A1)</w:t>
+              <w:t>Toán (7A1)</w:t>
             </w:r>
           </w:p>
         </w:tc>
@@ -379,9 +369,7 @@
                 <w:rFonts w:ascii="Times New Roman" w:hAnsi="Times New Roman"/>
                 <w:sz w:val="26"/>
               </w:rPr>
-              <w:t>Toán</w:t>
-              <w:br/>
-              <w:t>(6A1)</w:t>
+              <w:t>Toán (6A1)</w:t>
             </w:r>
           </w:p>
         </w:tc>
@@ -418,9 +406,7 @@
                 <w:rFonts w:ascii="Times New Roman" w:hAnsi="Times New Roman"/>
                 <w:sz w:val="26"/>
               </w:rPr>
-              <w:t>Toán</w:t>
-              <w:br/>
-              <w:t>(7A1)</w:t>
+              <w:t>Toán (7A1)</w:t>
             </w:r>
           </w:p>
         </w:tc>
@@ -455,9 +441,7 @@
                 <w:rFonts w:ascii="Times New Roman" w:hAnsi="Times New Roman"/>
                 <w:sz w:val="26"/>
               </w:rPr>
-              <w:t>Toán</w:t>
-              <w:br/>
-              <w:t>(6A1)</w:t>
+              <w:t>Toán (6A1)</w:t>
             </w:r>
           </w:p>
         </w:tc>
@@ -544,9 +528,7 @@
                 <w:rFonts w:ascii="Times New Roman" w:hAnsi="Times New Roman"/>
                 <w:sz w:val="26"/>
               </w:rPr>
-              <w:t>Toán</w:t>
-              <w:br/>
-              <w:t>(6A1)</w:t>
+              <w:t>Toán (6A1)</w:t>
             </w:r>
           </w:p>
         </w:tc>
@@ -563,9 +545,7 @@
                 <w:rFonts w:ascii="Times New Roman" w:hAnsi="Times New Roman"/>
                 <w:sz w:val="26"/>
               </w:rPr>
-              <w:t>Toán</w:t>
-              <w:br/>
-              <w:t>(8A1)</w:t>
+              <w:t>Toán (8A1)</w:t>
             </w:r>
           </w:p>
         </w:tc>
@@ -588,9 +568,7 @@
                 <w:rFonts w:ascii="Times New Roman" w:hAnsi="Times New Roman"/>
                 <w:sz w:val="26"/>
               </w:rPr>
-              <w:t>Toán</w:t>
-              <w:br/>
-              <w:t>(6A1)</w:t>
+              <w:t>Toán (6A1)</w:t>
             </w:r>
           </w:p>
         </w:tc>
@@ -655,9 +633,7 @@
                 <w:rFonts w:ascii="Times New Roman" w:hAnsi="Times New Roman"/>
                 <w:sz w:val="26"/>
               </w:rPr>
-              <w:t>Toán</w:t>
-              <w:br/>
-              <w:t>(8A1)</w:t>
+              <w:t>Toán (8A1)</w:t>
             </w:r>
           </w:p>
         </w:tc>
@@ -674,9 +650,7 @@
                 <w:rFonts w:ascii="Times New Roman" w:hAnsi="Times New Roman"/>
                 <w:sz w:val="26"/>
               </w:rPr>
-              <w:t>Toán</w:t>
-              <w:br/>
-              <w:t>(6A1)</w:t>
+              <w:t>Toán (6A1)</w:t>
             </w:r>
           </w:p>
         </w:tc>
@@ -693,9 +667,7 @@
                 <w:rFonts w:ascii="Times New Roman" w:hAnsi="Times New Roman"/>
                 <w:sz w:val="26"/>
               </w:rPr>
-              <w:t>Toán</w:t>
-              <w:br/>
-              <w:t>(7A1)</w:t>
+              <w:t>Toán (7A1)</w:t>
             </w:r>
           </w:p>
         </w:tc>
@@ -712,9 +684,7 @@
                 <w:rFonts w:ascii="Times New Roman" w:hAnsi="Times New Roman"/>
                 <w:sz w:val="26"/>
               </w:rPr>
-              <w:t>Toán</w:t>
-              <w:br/>
-              <w:t>(6A1)</w:t>
+              <w:t>Toán (6A1)</w:t>
             </w:r>
           </w:p>
         </w:tc>
@@ -731,9 +701,7 @@
                 <w:rFonts w:ascii="Times New Roman" w:hAnsi="Times New Roman"/>
                 <w:sz w:val="26"/>
               </w:rPr>
-              <w:t>Toán</w:t>
-              <w:br/>
-              <w:t>(7A1)</w:t>
+              <w:t>Toán (7A1)</w:t>
             </w:r>
           </w:p>
         </w:tc>
@@ -776,9 +744,7 @@
                 <w:rFonts w:ascii="Times New Roman" w:hAnsi="Times New Roman"/>
                 <w:sz w:val="26"/>
               </w:rPr>
-              <w:t>Toán</w:t>
-              <w:br/>
-              <w:t>(7A1)</w:t>
+              <w:t>Toán (7A1)</w:t>
             </w:r>
           </w:p>
         </w:tc>
@@ -801,9 +767,7 @@
                 <w:rFonts w:ascii="Times New Roman" w:hAnsi="Times New Roman"/>
                 <w:sz w:val="26"/>
               </w:rPr>
-              <w:t>Toán</w:t>
-              <w:br/>
-              <w:t>(7A1)</w:t>
+              <w:t>Toán (7A1)</w:t>
             </w:r>
           </w:p>
         </w:tc>
@@ -820,9 +784,7 @@
                 <w:rFonts w:ascii="Times New Roman" w:hAnsi="Times New Roman"/>
                 <w:sz w:val="26"/>
               </w:rPr>
-              <w:t>Toán</w:t>
-              <w:br/>
-              <w:t>(7A1)</w:t>
+              <w:t>Toán (7A1)</w:t>
             </w:r>
           </w:p>
         </w:tc>
@@ -883,9 +845,7 @@
                 <w:rFonts w:ascii="Times New Roman" w:hAnsi="Times New Roman"/>
                 <w:sz w:val="26"/>
               </w:rPr>
-              <w:t>Toán</w:t>
-              <w:br/>
-              <w:t>(8A1)</w:t>
+              <w:t>Toán (8A1)</w:t>
             </w:r>
           </w:p>
         </w:tc>
@@ -928,9 +888,7 @@
                 <w:rFonts w:ascii="Times New Roman" w:hAnsi="Times New Roman"/>
                 <w:sz w:val="26"/>
               </w:rPr>
-              <w:t>Toán</w:t>
-              <w:br/>
-              <w:t>(6A1)</w:t>
+              <w:t>Toán (6A1)</w:t>
             </w:r>
           </w:p>
         </w:tc>
@@ -947,9 +905,7 @@
                 <w:rFonts w:ascii="Times New Roman" w:hAnsi="Times New Roman"/>
                 <w:sz w:val="26"/>
               </w:rPr>
-              <w:t>Toán</w:t>
-              <w:br/>
-              <w:t>(6A1)</w:t>
+              <w:t>Toán (6A1)</w:t>
             </w:r>
           </w:p>
         </w:tc>
@@ -966,9 +922,7 @@
                 <w:rFonts w:ascii="Times New Roman" w:hAnsi="Times New Roman"/>
                 <w:sz w:val="26"/>
               </w:rPr>
-              <w:t>Toán</w:t>
-              <w:br/>
-              <w:t>(8A1)</w:t>
+              <w:t>Toán (8A1)</w:t>
             </w:r>
           </w:p>
         </w:tc>
@@ -985,9 +939,7 @@
                 <w:rFonts w:ascii="Times New Roman" w:hAnsi="Times New Roman"/>
                 <w:sz w:val="26"/>
               </w:rPr>
-              <w:t>Toán</w:t>
-              <w:br/>
-              <w:t>(8A1)</w:t>
+              <w:t>Toán (8A1)</w:t>
             </w:r>
           </w:p>
         </w:tc>

</xml_diff>